<commit_message>
docs: revise submission_guide.docx — moderate margins + silent MCP auto-detect note
Rebuilt with moderate margins (top/bottom 1", left/right 0.75") per user preference.
Updated Section 4 rebuild instructions: USE_MCP=true now works by default with
automatic silent fallback; removed the old USE_MCP=false workaround note.
Validated clean (0 schema errors).

Co-Authored-By: Claude Sonnet 4.6 <noreply@anthropic.com>
</commit_message>
<xml_diff>
--- a/docs/submission_guide.docx
+++ b/docs/submission_guide.docx
@@ -4,7 +4,7 @@
   <w:body>
     <w:p>
       <w:pPr>
-        <w:spacing w:before="720" w:after="120"/>
+        <w:spacing w:before="600" w:after="120"/>
         <w:jc w:val="center"/>
       </w:pPr>
       <w:r>
@@ -73,7 +73,7 @@
     </w:p>
     <w:p>
       <w:pPr>
-        <w:spacing w:before="360" w:after="120"/>
+        <w:spacing w:before="320" w:after="100"/>
       </w:pPr>
       <w:r>
         <w:rPr>
@@ -81,7 +81,7 @@
           <w:b/>
           <w:i w:val="0"/>
           <w:color w:val="1F3864"/>
-          <w:sz w:val="28"/>
+          <w:sz w:val="26"/>
         </w:rPr>
         <w:t>1.  How to Find Each Required Submission Item</w:t>
       </w:r>
@@ -98,7 +98,7 @@
           <w:color w:val="000000"/>
           <w:sz w:val="20"/>
         </w:rPr>
-        <w:t>This document maps each graded submission requirement to the exact file(s) in the zip package. The zip is named Capstone_Project_Manoj_Bansal.zip. All paths below are relative to the zip root.</w:t>
+        <w:t>This document maps each graded submission requirement to the exact file(s) in the zip package. The zip is named Capstone_Project_Manoj_Bansal.zip. All paths are relative to the zip root.</w:t>
       </w:r>
     </w:p>
     <w:p>
@@ -113,10 +113,10 @@
         <w:tblLook w:firstColumn="1" w:firstRow="1" w:lastColumn="0" w:lastRow="0" w:noHBand="0" w:noVBand="1" w:val="04A0"/>
       </w:tblPr>
       <w:tblGrid>
-        <w:gridCol w:w="2256"/>
-        <w:gridCol w:w="2256"/>
-        <w:gridCol w:w="2256"/>
-        <w:gridCol w:w="2256"/>
+        <w:gridCol w:w="2435"/>
+        <w:gridCol w:w="2435"/>
+        <w:gridCol w:w="2435"/>
+        <w:gridCol w:w="2435"/>
       </w:tblGrid>
       <w:tr>
         <w:tc>
@@ -143,7 +143,7 @@
         </w:tc>
         <w:tc>
           <w:tcPr>
-            <w:tcW w:type="dxa" w:w="1247"/>
+            <w:tcW w:type="dxa" w:w="1191"/>
             <w:shd w:val="clear" w:color="auto" w:fill="D5E8F0"/>
             <w:vAlign w:val="top"/>
           </w:tcPr>
@@ -187,7 +187,7 @@
         </w:tc>
         <w:tc>
           <w:tcPr>
-            <w:tcW w:type="dxa" w:w="3640"/>
+            <w:tcW w:type="dxa" w:w="3844"/>
             <w:shd w:val="clear" w:color="auto" w:fill="D5E8F0"/>
             <w:vAlign w:val="top"/>
           </w:tcPr>
@@ -234,7 +234,7 @@
         </w:tc>
         <w:tc>
           <w:tcPr>
-            <w:tcW w:type="dxa" w:w="1247"/>
+            <w:tcW w:type="dxa" w:w="1191"/>
             <w:vAlign w:val="top"/>
           </w:tcPr>
           <w:p>
@@ -288,7 +288,7 @@
         </w:tc>
         <w:tc>
           <w:tcPr>
-            <w:tcW w:type="dxa" w:w="3640"/>
+            <w:tcW w:type="dxa" w:w="3844"/>
             <w:vAlign w:val="top"/>
           </w:tcPr>
           <w:p>
@@ -303,7 +303,7 @@
                 <w:color w:val="000000"/>
                 <w:sz w:val="18"/>
               </w:rPr>
-              <w:t>README.md has step-by-step Quick Start (clone → venv → install → configure → ingest → run). Uses Vocareum API key; set OPENAI_BASE_URL=https://openai.vocareum.com/v1 in .env</w:t>
+              <w:t>README.md has step-by-step Quick Start (clone → venv → install → configure → ingest → run). USE_MCP=true works by default; the agent auto-detects whether the mcp package is installed and silently falls back to direct tool imports if not.</w:t>
             </w:r>
           </w:p>
         </w:tc>
@@ -334,7 +334,7 @@
         </w:tc>
         <w:tc>
           <w:tcPr>
-            <w:tcW w:type="dxa" w:w="1247"/>
+            <w:tcW w:type="dxa" w:w="1191"/>
             <w:vAlign w:val="top"/>
           </w:tcPr>
           <w:p>
@@ -376,7 +376,7 @@
         </w:tc>
         <w:tc>
           <w:tcPr>
-            <w:tcW w:type="dxa" w:w="3640"/>
+            <w:tcW w:type="dxa" w:w="3844"/>
             <w:vAlign w:val="top"/>
           </w:tcPr>
           <w:p>
@@ -424,7 +424,7 @@
         </w:tc>
         <w:tc>
           <w:tcPr>
-            <w:tcW w:type="dxa" w:w="1247"/>
+            <w:tcW w:type="dxa" w:w="1191"/>
             <w:vAlign w:val="top"/>
           </w:tcPr>
           <w:p>
@@ -468,7 +468,7 @@
         </w:tc>
         <w:tc>
           <w:tcPr>
-            <w:tcW w:type="dxa" w:w="3640"/>
+            <w:tcW w:type="dxa" w:w="3844"/>
             <w:vAlign w:val="top"/>
           </w:tcPr>
           <w:p>
@@ -512,7 +512,7 @@
         </w:tc>
         <w:tc>
           <w:tcPr>
-            <w:tcW w:type="dxa" w:w="1247"/>
+            <w:tcW w:type="dxa" w:w="1191"/>
             <w:vAlign w:val="top"/>
           </w:tcPr>
           <w:p>
@@ -554,7 +554,7 @@
         </w:tc>
         <w:tc>
           <w:tcPr>
-            <w:tcW w:type="dxa" w:w="3640"/>
+            <w:tcW w:type="dxa" w:w="3844"/>
             <w:vAlign w:val="top"/>
           </w:tcPr>
           <w:p>
@@ -600,7 +600,7 @@
         </w:tc>
         <w:tc>
           <w:tcPr>
-            <w:tcW w:type="dxa" w:w="1247"/>
+            <w:tcW w:type="dxa" w:w="1191"/>
             <w:vAlign w:val="top"/>
           </w:tcPr>
           <w:p>
@@ -642,7 +642,7 @@
         </w:tc>
         <w:tc>
           <w:tcPr>
-            <w:tcW w:type="dxa" w:w="3640"/>
+            <w:tcW w:type="dxa" w:w="3844"/>
             <w:vAlign w:val="top"/>
           </w:tcPr>
           <w:p>
@@ -688,7 +688,7 @@
         </w:tc>
         <w:tc>
           <w:tcPr>
-            <w:tcW w:type="dxa" w:w="1247"/>
+            <w:tcW w:type="dxa" w:w="1191"/>
             <w:vAlign w:val="top"/>
           </w:tcPr>
           <w:p>
@@ -730,7 +730,7 @@
         </w:tc>
         <w:tc>
           <w:tcPr>
-            <w:tcW w:type="dxa" w:w="3640"/>
+            <w:tcW w:type="dxa" w:w="3844"/>
             <w:vAlign w:val="top"/>
           </w:tcPr>
           <w:p>
@@ -758,7 +758,7 @@
     </w:p>
     <w:p>
       <w:pPr>
-        <w:spacing w:before="360" w:after="120"/>
+        <w:spacing w:before="320" w:after="100"/>
       </w:pPr>
       <w:r>
         <w:rPr>
@@ -766,7 +766,7 @@
           <w:b/>
           <w:i w:val="0"/>
           <w:color w:val="1F3864"/>
-          <w:sz w:val="28"/>
+          <w:sz w:val="26"/>
         </w:rPr>
         <w:t>2.  Additional Documents and Their Purpose</w:t>
       </w:r>
@@ -798,9 +798,9 @@
         <w:tblLook w:firstColumn="1" w:firstRow="1" w:lastColumn="0" w:lastRow="0" w:noHBand="0" w:noVBand="1" w:val="04A0"/>
       </w:tblPr>
       <w:tblGrid>
-        <w:gridCol w:w="3009"/>
-        <w:gridCol w:w="3009"/>
-        <w:gridCol w:w="3009"/>
+        <w:gridCol w:w="3247"/>
+        <w:gridCol w:w="3247"/>
+        <w:gridCol w:w="3247"/>
       </w:tblGrid>
       <w:tr>
         <w:tc>
@@ -827,7 +827,7 @@
         </w:tc>
         <w:tc>
           <w:tcPr>
-            <w:tcW w:type="dxa" w:w="1247"/>
+            <w:tcW w:type="dxa" w:w="1191"/>
             <w:shd w:val="clear" w:color="auto" w:fill="D5E8F0"/>
             <w:vAlign w:val="top"/>
           </w:tcPr>
@@ -849,7 +849,7 @@
         </w:tc>
         <w:tc>
           <w:tcPr>
-            <w:tcW w:type="dxa" w:w="5794"/>
+            <w:tcW w:type="dxa" w:w="5998"/>
             <w:shd w:val="clear" w:color="auto" w:fill="D5E8F0"/>
             <w:vAlign w:val="top"/>
           </w:tcPr>
@@ -894,7 +894,7 @@
         </w:tc>
         <w:tc>
           <w:tcPr>
-            <w:tcW w:type="dxa" w:w="1247"/>
+            <w:tcW w:type="dxa" w:w="1191"/>
             <w:vAlign w:val="top"/>
           </w:tcPr>
           <w:p>
@@ -915,7 +915,7 @@
         </w:tc>
         <w:tc>
           <w:tcPr>
-            <w:tcW w:type="dxa" w:w="5794"/>
+            <w:tcW w:type="dxa" w:w="5998"/>
             <w:vAlign w:val="top"/>
           </w:tcPr>
           <w:p>
@@ -930,7 +930,7 @@
                 <w:color w:val="000000"/>
                 <w:sz w:val="18"/>
               </w:rPr>
-              <w:t>Full technical specification: system architecture, data flow, tool contracts, safety policy, and MCP integration design. Primary design reference document.</w:t>
+              <w:t>Full technical specification: system architecture, data flow, tool contracts, safety policy, and MCP integration design. Primary design reference.</w:t>
             </w:r>
           </w:p>
         </w:tc>
@@ -959,7 +959,7 @@
         </w:tc>
         <w:tc>
           <w:tcPr>
-            <w:tcW w:type="dxa" w:w="1247"/>
+            <w:tcW w:type="dxa" w:w="1191"/>
             <w:vAlign w:val="top"/>
           </w:tcPr>
           <w:p>
@@ -980,7 +980,7 @@
         </w:tc>
         <w:tc>
           <w:tcPr>
-            <w:tcW w:type="dxa" w:w="5794"/>
+            <w:tcW w:type="dxa" w:w="5998"/>
             <w:vAlign w:val="top"/>
           </w:tcPr>
           <w:p>
@@ -995,7 +995,7 @@
                 <w:color w:val="000000"/>
                 <w:sz w:val="18"/>
               </w:rPr>
-              <w:t>Architecture diagrams with component descriptions: Agent layer, RAG pipeline, Tool layer, Safety Gate, Langfuse Observability, RLHF pipeline, MCP server, RM Dashboard, and all data stores (ChromaDB, feedback_store.json, adaptive_policy.json, escalations.json).</w:t>
+              <w:t>Architecture diagrams with component descriptions: Agent layer, RAG pipeline, Tool layer, Safety Gate, Langfuse Observability, RLHF pipeline, MCP server, RM Dashboard, and all data stores.</w:t>
             </w:r>
           </w:p>
         </w:tc>
@@ -1024,7 +1024,7 @@
         </w:tc>
         <w:tc>
           <w:tcPr>
-            <w:tcW w:type="dxa" w:w="1247"/>
+            <w:tcW w:type="dxa" w:w="1191"/>
             <w:vAlign w:val="top"/>
           </w:tcPr>
           <w:p>
@@ -1045,7 +1045,7 @@
         </w:tc>
         <w:tc>
           <w:tcPr>
-            <w:tcW w:type="dxa" w:w="5794"/>
+            <w:tcW w:type="dxa" w:w="5998"/>
             <w:vAlign w:val="top"/>
           </w:tcPr>
           <w:p>
@@ -1060,7 +1060,7 @@
                 <w:color w:val="000000"/>
                 <w:sz w:val="18"/>
               </w:rPr>
-              <w:t>Method-level reference for every significant function across all modules. Section 1: annotated module table. Section 2: full method index with signatures and descriptions. Useful for deep code review.</w:t>
+              <w:t>Method-level reference for every significant function across all modules. Section 1: annotated module table. Section 2: full method index with signatures. Useful for deep code review.</w:t>
             </w:r>
           </w:p>
         </w:tc>
@@ -1089,7 +1089,7 @@
         </w:tc>
         <w:tc>
           <w:tcPr>
-            <w:tcW w:type="dxa" w:w="1247"/>
+            <w:tcW w:type="dxa" w:w="1191"/>
             <w:vAlign w:val="top"/>
           </w:tcPr>
           <w:p>
@@ -1110,7 +1110,7 @@
         </w:tc>
         <w:tc>
           <w:tcPr>
-            <w:tcW w:type="dxa" w:w="5794"/>
+            <w:tcW w:type="dxa" w:w="5998"/>
             <w:vAlign w:val="top"/>
           </w:tcPr>
           <w:p>
@@ -1154,7 +1154,7 @@
         </w:tc>
         <w:tc>
           <w:tcPr>
-            <w:tcW w:type="dxa" w:w="1247"/>
+            <w:tcW w:type="dxa" w:w="1191"/>
             <w:vAlign w:val="top"/>
           </w:tcPr>
           <w:p>
@@ -1175,7 +1175,7 @@
         </w:tc>
         <w:tc>
           <w:tcPr>
-            <w:tcW w:type="dxa" w:w="5794"/>
+            <w:tcW w:type="dxa" w:w="5998"/>
             <w:vAlign w:val="top"/>
           </w:tcPr>
           <w:p>
@@ -1221,7 +1221,7 @@
         </w:tc>
         <w:tc>
           <w:tcPr>
-            <w:tcW w:type="dxa" w:w="1247"/>
+            <w:tcW w:type="dxa" w:w="1191"/>
             <w:vAlign w:val="top"/>
           </w:tcPr>
           <w:p>
@@ -1242,7 +1242,7 @@
         </w:tc>
         <w:tc>
           <w:tcPr>
-            <w:tcW w:type="dxa" w:w="5794"/>
+            <w:tcW w:type="dxa" w:w="5998"/>
             <w:vAlign w:val="top"/>
           </w:tcPr>
           <w:p>
@@ -1257,7 +1257,7 @@
                 <w:color w:val="000000"/>
                 <w:sz w:val="18"/>
               </w:rPr>
-              <w:t>15-slide presentation deck covering problem, architecture, tools, safety, RLHF, evaluation, and demo. Speaker notes in docs/presentation_script.md. PDF version for offline viewing without PowerPoint.</w:t>
+              <w:t>15-slide presentation deck covering problem, architecture, tools, safety, RLHF, evaluation, and demo. Speaker notes in docs/presentation_script.md. PDF version for offline viewing.</w:t>
             </w:r>
           </w:p>
         </w:tc>
@@ -1286,7 +1286,7 @@
         </w:tc>
         <w:tc>
           <w:tcPr>
-            <w:tcW w:type="dxa" w:w="1247"/>
+            <w:tcW w:type="dxa" w:w="1191"/>
             <w:vAlign w:val="top"/>
           </w:tcPr>
           <w:p>
@@ -1307,7 +1307,7 @@
         </w:tc>
         <w:tc>
           <w:tcPr>
-            <w:tcW w:type="dxa" w:w="5794"/>
+            <w:tcW w:type="dxa" w:w="5998"/>
             <w:vAlign w:val="top"/>
           </w:tcPr>
           <w:p>
@@ -1322,7 +1322,7 @@
                 <w:color w:val="000000"/>
                 <w:sz w:val="18"/>
               </w:rPr>
-              <w:t>Full task-by-task build log across 9 phases with done-criteria checked off. Transparent record of engineering journey, design decisions made at each stage, and test milestones.</w:t>
+              <w:t>Full task-by-task build log across 9 phases with done-criteria checked off. Transparent record of engineering journey, design decisions, and test milestones.</w:t>
             </w:r>
           </w:p>
         </w:tc>
@@ -1353,7 +1353,7 @@
         </w:tc>
         <w:tc>
           <w:tcPr>
-            <w:tcW w:type="dxa" w:w="1247"/>
+            <w:tcW w:type="dxa" w:w="1191"/>
             <w:vAlign w:val="top"/>
           </w:tcPr>
           <w:p>
@@ -1374,7 +1374,7 @@
         </w:tc>
         <w:tc>
           <w:tcPr>
-            <w:tcW w:type="dxa" w:w="5794"/>
+            <w:tcW w:type="dxa" w:w="5998"/>
             <w:vAlign w:val="top"/>
           </w:tcPr>
           <w:p>
@@ -1389,7 +1389,7 @@
                 <w:color w:val="000000"/>
                 <w:sz w:val="18"/>
               </w:rPr>
-              <w:t>One exploration notebook per phase: rules agent → LLM integration → RAG → 5 tools → multi-turn memory → RLHF adaptation → Streamlit deployment. Demonstrates iterative development process.</w:t>
+              <w:t>One exploration notebook per phase: rules agent → LLM → RAG → 5 tools → memory → RLHF → Streamlit deployment. Demonstrates iterative development.</w:t>
             </w:r>
           </w:p>
         </w:tc>
@@ -1418,7 +1418,7 @@
         </w:tc>
         <w:tc>
           <w:tcPr>
-            <w:tcW w:type="dxa" w:w="1247"/>
+            <w:tcW w:type="dxa" w:w="1191"/>
             <w:vAlign w:val="top"/>
           </w:tcPr>
           <w:p>
@@ -1439,7 +1439,7 @@
         </w:tc>
         <w:tc>
           <w:tcPr>
-            <w:tcW w:type="dxa" w:w="5794"/>
+            <w:tcW w:type="dxa" w:w="5998"/>
             <w:vAlign w:val="top"/>
           </w:tcPr>
           <w:p>
@@ -1454,7 +1454,7 @@
                 <w:color w:val="000000"/>
                 <w:sz w:val="18"/>
               </w:rPr>
-              <w:t>Live RLHF artefacts: feedback_store.json (20 real customer ratings + text comments), adaptive_policy.json (3 LLM-generated behavioural instructions from low-rated sessions), escalations.json (RM escalation queue).</w:t>
+              <w:t>Live RLHF artefacts: feedback_store.json (20 real ratings + comments), adaptive_policy.json (3 LLM-generated behavioural instructions), escalations.json (RM escalation queue).</w:t>
             </w:r>
           </w:p>
         </w:tc>
@@ -1485,7 +1485,7 @@
         </w:tc>
         <w:tc>
           <w:tcPr>
-            <w:tcW w:type="dxa" w:w="1247"/>
+            <w:tcW w:type="dxa" w:w="1191"/>
             <w:vAlign w:val="top"/>
           </w:tcPr>
           <w:p>
@@ -1506,7 +1506,7 @@
         </w:tc>
         <w:tc>
           <w:tcPr>
-            <w:tcW w:type="dxa" w:w="5794"/>
+            <w:tcW w:type="dxa" w:w="5998"/>
             <w:vAlign w:val="top"/>
           </w:tcPr>
           <w:p>
@@ -1521,7 +1521,7 @@
                 <w:color w:val="000000"/>
                 <w:sz w:val="18"/>
               </w:rPr>
-              <w:t>Full automated test suite covering all modules. Run: USE_MCP=false python -m pytest. Includes unit, integration, and RLHF adaptive tests. All 424 pass.</w:t>
+              <w:t>Full automated test suite covering all modules. Run with: python -m pytest. Includes unit, integration, and RLHF adaptive tests. All 424 pass.</w:t>
             </w:r>
           </w:p>
         </w:tc>
@@ -1534,7 +1534,7 @@
     </w:p>
     <w:p>
       <w:pPr>
-        <w:spacing w:before="360" w:after="120"/>
+        <w:spacing w:before="320" w:after="100"/>
       </w:pPr>
       <w:r>
         <w:rPr>
@@ -1542,7 +1542,7 @@
           <w:b/>
           <w:i w:val="0"/>
           <w:color w:val="1F3864"/>
-          <w:sz w:val="28"/>
+          <w:sz w:val="26"/>
         </w:rPr>
         <w:t>3.  Evidence for Graded Criteria</w:t>
       </w:r>
@@ -1574,14 +1574,14 @@
         <w:tblLook w:firstColumn="1" w:firstRow="1" w:lastColumn="0" w:lastRow="0" w:noHBand="0" w:noVBand="1" w:val="04A0"/>
       </w:tblPr>
       <w:tblGrid>
-        <w:gridCol w:w="3009"/>
-        <w:gridCol w:w="3009"/>
-        <w:gridCol w:w="3009"/>
+        <w:gridCol w:w="3247"/>
+        <w:gridCol w:w="3247"/>
+        <w:gridCol w:w="3247"/>
       </w:tblGrid>
       <w:tr>
         <w:tc>
           <w:tcPr>
-            <w:tcW w:type="dxa" w:w="1984"/>
+            <w:tcW w:type="dxa" w:w="1871"/>
             <w:shd w:val="clear" w:color="auto" w:fill="D5E8F0"/>
             <w:vAlign w:val="top"/>
           </w:tcPr>
@@ -1603,7 +1603,7 @@
         </w:tc>
         <w:tc>
           <w:tcPr>
-            <w:tcW w:type="dxa" w:w="2835"/>
+            <w:tcW w:type="dxa" w:w="2778"/>
             <w:shd w:val="clear" w:color="auto" w:fill="D5E8F0"/>
             <w:vAlign w:val="top"/>
           </w:tcPr>
@@ -1625,7 +1625,7 @@
         </w:tc>
         <w:tc>
           <w:tcPr>
-            <w:tcW w:type="dxa" w:w="4774"/>
+            <w:tcW w:type="dxa" w:w="5091"/>
             <w:shd w:val="clear" w:color="auto" w:fill="D5E8F0"/>
             <w:vAlign w:val="top"/>
           </w:tcPr>
@@ -1649,7 +1649,7 @@
       <w:tr>
         <w:tc>
           <w:tcPr>
-            <w:tcW w:type="dxa" w:w="1984"/>
+            <w:tcW w:type="dxa" w:w="1871"/>
             <w:vAlign w:val="top"/>
           </w:tcPr>
           <w:p>
@@ -1670,7 +1670,7 @@
         </w:tc>
         <w:tc>
           <w:tcPr>
-            <w:tcW w:type="dxa" w:w="2835"/>
+            <w:tcW w:type="dxa" w:w="2778"/>
             <w:vAlign w:val="top"/>
           </w:tcPr>
           <w:p>
@@ -1695,7 +1695,7 @@
         </w:tc>
         <w:tc>
           <w:tcPr>
-            <w:tcW w:type="dxa" w:w="4774"/>
+            <w:tcW w:type="dxa" w:w="5091"/>
             <w:vAlign w:val="top"/>
           </w:tcPr>
           <w:p>
@@ -1710,7 +1710,7 @@
                 <w:color w:val="000000"/>
                 <w:sz w:val="18"/>
               </w:rPr>
-              <w:t>LLM-as-judge scores: relevance = 1.00 across all 20 questions. ChromaDB persistent store with text-embedding-3-small embeddings. 5 synthetic policy documents chunked, embedded, and indexed. RAG retrieval observation visible in Langfuse traces.</w:t>
+              <w:t>LLM-as-judge scores: relevance = 1.00 across all 20 questions. ChromaDB persistent store with text-embedding-3-small. 5 synthetic policy documents chunked, embedded, and indexed. RAG retrieval visible in Langfuse traces.</w:t>
             </w:r>
           </w:p>
         </w:tc>
@@ -1718,7 +1718,7 @@
       <w:tr>
         <w:tc>
           <w:tcPr>
-            <w:tcW w:type="dxa" w:w="1984"/>
+            <w:tcW w:type="dxa" w:w="1871"/>
             <w:vAlign w:val="top"/>
           </w:tcPr>
           <w:p>
@@ -1739,7 +1739,7 @@
         </w:tc>
         <w:tc>
           <w:tcPr>
-            <w:tcW w:type="dxa" w:w="2835"/>
+            <w:tcW w:type="dxa" w:w="2778"/>
             <w:vAlign w:val="top"/>
           </w:tcPr>
           <w:p>
@@ -1764,7 +1764,7 @@
         </w:tc>
         <w:tc>
           <w:tcPr>
-            <w:tcW w:type="dxa" w:w="4774"/>
+            <w:tcW w:type="dxa" w:w="5091"/>
             <w:vAlign w:val="top"/>
           </w:tcPr>
           <w:p>
@@ -1779,7 +1779,7 @@
                 <w:color w:val="000000"/>
                 <w:sz w:val="18"/>
               </w:rPr>
-              <w:t>5 LangChain tools invoked via ReAct loop. generate_escalation_summary: 100% accuracy (6/6). check_eligibility: 83% (5/6). Demo script shows tool call inputs/outputs for all 5 scenarios. Tool contracts in specification_v2.docx.</w:t>
+              <w:t>5 LangChain tools via ReAct loop. generate_escalation_summary: 100% accuracy (6/6). check_eligibility: 83% (5/6). Demo script shows tool inputs/outputs for all 5 scenarios. Tool contracts in specification_v2.docx.</w:t>
             </w:r>
           </w:p>
         </w:tc>
@@ -1787,7 +1787,7 @@
       <w:tr>
         <w:tc>
           <w:tcPr>
-            <w:tcW w:type="dxa" w:w="1984"/>
+            <w:tcW w:type="dxa" w:w="1871"/>
             <w:vAlign w:val="top"/>
           </w:tcPr>
           <w:p>
@@ -1808,7 +1808,7 @@
         </w:tc>
         <w:tc>
           <w:tcPr>
-            <w:tcW w:type="dxa" w:w="2835"/>
+            <w:tcW w:type="dxa" w:w="2778"/>
             <w:vAlign w:val="top"/>
           </w:tcPr>
           <w:p>
@@ -1833,7 +1833,7 @@
         </w:tc>
         <w:tc>
           <w:tcPr>
-            <w:tcW w:type="dxa" w:w="4774"/>
+            <w:tcW w:type="dxa" w:w="5091"/>
             <w:vAlign w:val="top"/>
           </w:tcPr>
           <w:p>
@@ -1848,7 +1848,7 @@
                 <w:color w:val="000000"/>
                 <w:sz w:val="18"/>
               </w:rPr>
-              <w:t>ConversationBufferWindowMemory(k=10) retains last 10 turns. next_question() planner drives profile collection in a fixed sequence (product → amount → tenure → income → age → CIBIL → employment). SessionState dataclass tracks all collected fields.</w:t>
+              <w:t>ConversationBufferWindowMemory(k=10) retains last 10 turns. next_question() planner drives profile collection sequence. SessionState dataclass tracks all collected fields across turns.</w:t>
             </w:r>
           </w:p>
         </w:tc>
@@ -1856,7 +1856,7 @@
       <w:tr>
         <w:tc>
           <w:tcPr>
-            <w:tcW w:type="dxa" w:w="1984"/>
+            <w:tcW w:type="dxa" w:w="1871"/>
             <w:vAlign w:val="top"/>
           </w:tcPr>
           <w:p>
@@ -1877,7 +1877,7 @@
         </w:tc>
         <w:tc>
           <w:tcPr>
-            <w:tcW w:type="dxa" w:w="2835"/>
+            <w:tcW w:type="dxa" w:w="2778"/>
             <w:vAlign w:val="top"/>
           </w:tcPr>
           <w:p>
@@ -1902,7 +1902,7 @@
         </w:tc>
         <w:tc>
           <w:tcPr>
-            <w:tcW w:type="dxa" w:w="4774"/>
+            <w:tcW w:type="dxa" w:w="5091"/>
             <w:vAlign w:val="top"/>
           </w:tcPr>
           <w:p>
@@ -1917,7 +1917,7 @@
                 <w:color w:val="000000"/>
                 <w:sz w:val="18"/>
               </w:rPr>
-              <w:t>Two-layer RLHF. Layer 1: within-session inject_feedback_signal() queues corrections as SystemMessage (≤2 stars). Layer 2: update_adaptive_policy() calls GPT-4o-mini with low-rated comments; writes behavioural instructions to adaptive_policy.json. 3 live entries currently active in the system prompt.</w:t>
+              <w:t>Two-layer RLHF. Layer 1: inject_feedback_signal() queues corrections as SystemMessage within the live session. Layer 2: update_adaptive_policy() calls GPT-4o-mini with low-rated comments; writes instructions to adaptive_policy.json. 3 live entries currently active.</w:t>
             </w:r>
           </w:p>
         </w:tc>
@@ -1925,7 +1925,7 @@
       <w:tr>
         <w:tc>
           <w:tcPr>
-            <w:tcW w:type="dxa" w:w="1984"/>
+            <w:tcW w:type="dxa" w:w="1871"/>
             <w:vAlign w:val="top"/>
           </w:tcPr>
           <w:p>
@@ -1946,7 +1946,7 @@
         </w:tc>
         <w:tc>
           <w:tcPr>
-            <w:tcW w:type="dxa" w:w="2835"/>
+            <w:tcW w:type="dxa" w:w="2778"/>
             <w:vAlign w:val="top"/>
           </w:tcPr>
           <w:p>
@@ -1971,7 +1971,7 @@
         </w:tc>
         <w:tc>
           <w:tcPr>
-            <w:tcW w:type="dxa" w:w="4774"/>
+            <w:tcW w:type="dxa" w:w="5091"/>
             <w:vAlign w:val="top"/>
           </w:tcPr>
           <w:p>
@@ -1986,7 +1986,7 @@
                 <w:color w:val="000000"/>
                 <w:sz w:val="18"/>
               </w:rPr>
-              <w:t>Live results (2026-06-28, USE_MCP=false): RAG 45% (9/20), Tool selection 43% (13/30), Safety 100% (5/5). Root-cause analysis of H2 faithfulness failure, fix applied to system prompt, before (F=0.00) and after (F=1.00) scores documented.</w:t>
+              <w:t>Live results (2026-06-28): RAG 45% (9/20), Tool selection 43% (13/30), Safety 100% (5/5). Root-cause analysis of H2 faithfulness failure, fix applied to system prompt, before (F=0.00) and after (F=1.00) documented.</w:t>
             </w:r>
           </w:p>
         </w:tc>
@@ -1994,7 +1994,7 @@
       <w:tr>
         <w:tc>
           <w:tcPr>
-            <w:tcW w:type="dxa" w:w="1984"/>
+            <w:tcW w:type="dxa" w:w="1871"/>
             <w:vAlign w:val="top"/>
           </w:tcPr>
           <w:p>
@@ -2015,7 +2015,7 @@
         </w:tc>
         <w:tc>
           <w:tcPr>
-            <w:tcW w:type="dxa" w:w="2835"/>
+            <w:tcW w:type="dxa" w:w="2778"/>
             <w:vAlign w:val="top"/>
           </w:tcPr>
           <w:p>
@@ -2040,7 +2040,7 @@
         </w:tc>
         <w:tc>
           <w:tcPr>
-            <w:tcW w:type="dxa" w:w="4774"/>
+            <w:tcW w:type="dxa" w:w="5091"/>
             <w:vAlign w:val="top"/>
           </w:tcPr>
           <w:p>
@@ -2055,7 +2055,7 @@
                 <w:color w:val="000000"/>
                 <w:sz w:val="18"/>
               </w:rPr>
-              <w:t>Two-stage gate: keyword_filter (Stage A, &lt;1 ms, 0 LLM cost) blocks 4/5 adversarial prompts. GPT-4o-mini classifier (Stage B) catches the 5th (money laundering injection). PII masker (pii_filter.py) applied to every log write — Aadhaar, PAN, mobile, email, account numbers masked.</w:t>
+              <w:t>Two-stage gate: keyword_filter (Stage A, &lt;1 ms, 0 LLM cost) blocks 4/5 adversarial prompts; GPT-4o-mini classifier (Stage B) catches the 5th (money laundering). PII masker (pii_filter.py) applied to every log write.</w:t>
             </w:r>
           </w:p>
         </w:tc>
@@ -2068,7 +2068,7 @@
     </w:p>
     <w:p>
       <w:pPr>
-        <w:spacing w:before="360" w:after="120"/>
+        <w:spacing w:before="320" w:after="100"/>
       </w:pPr>
       <w:r>
         <w:rPr>
@@ -2076,7 +2076,7 @@
           <w:b/>
           <w:i w:val="0"/>
           <w:color w:val="1F3864"/>
-          <w:sz w:val="28"/>
+          <w:sz w:val="26"/>
         </w:rPr>
         <w:t>4.  Rebuild Instructions for Evaluators</w:t>
       </w:r>
@@ -2093,7 +2093,7 @@
           <w:color w:val="000000"/>
           <w:sz w:val="20"/>
         </w:rPr>
-        <w:t>Two items are intentionally excluded from the zip to keep it small and avoid committing sensitive data:</w:t>
+        <w:t>Two items are excluded from the zip to keep it small and avoid committing sensitive data:</w:t>
       </w:r>
     </w:p>
     <w:p>
@@ -2103,7 +2103,7 @@
     </w:p>
     <w:p>
       <w:pPr>
-        <w:spacing w:before="80" w:after="40"/>
+        <w:spacing w:before="60" w:after="40"/>
         <w:ind w:left="283"/>
       </w:pPr>
       <w:r>
@@ -2124,12 +2124,12 @@
           <w:color w:val="000000"/>
           <w:sz w:val="20"/>
         </w:rPr>
-        <w:t>knowledge/chromadb/ is NOT included — it is generated at runtime (4.7 MB). After installing requirements, rebuild it:</w:t>
+        <w:t>knowledge/chromadb/ is NOT included — it is generated at runtime (4.7 MB). Rebuild after pip install:</w:t>
       </w:r>
     </w:p>
     <w:p>
       <w:pPr>
-        <w:spacing w:before="40" w:after="40"/>
+        <w:spacing w:before="20" w:after="20"/>
         <w:ind w:left="567"/>
       </w:pPr>
       <w:r>
@@ -2165,7 +2165,7 @@
     </w:p>
     <w:p>
       <w:pPr>
-        <w:spacing w:before="80" w:after="40"/>
+        <w:spacing w:before="60" w:after="40"/>
         <w:ind w:left="283"/>
       </w:pPr>
       <w:r>
@@ -2191,7 +2191,7 @@
     </w:p>
     <w:p>
       <w:pPr>
-        <w:spacing w:before="40" w:after="40"/>
+        <w:spacing w:before="20" w:after="20"/>
         <w:ind w:left="567"/>
       </w:pPr>
       <w:r>
@@ -2217,12 +2217,12 @@
           <w:color w:val="000000"/>
           <w:sz w:val="20"/>
         </w:rPr>
-        <w:t>Then open .env and set the following (Vocareum users):</w:t>
+        <w:t>Open .env and set your Vocareum or OpenAI key:</w:t>
       </w:r>
     </w:p>
     <w:p>
       <w:pPr>
-        <w:spacing w:before="40" w:after="40"/>
+        <w:spacing w:before="20" w:after="20"/>
         <w:ind w:left="567"/>
       </w:pPr>
       <w:r>
@@ -2233,12 +2233,12 @@
           <w:color w:val="156082"/>
           <w:sz w:val="18"/>
         </w:rPr>
-        <w:t>OPENAI_API_KEY=&lt;your-vocareum-key&gt;</w:t>
+        <w:t>OPENAI_API_KEY=&lt;your-key&gt;</w:t>
       </w:r>
     </w:p>
     <w:p>
       <w:pPr>
-        <w:spacing w:before="40" w:after="40"/>
+        <w:spacing w:before="20" w:after="20"/>
         <w:ind w:left="567"/>
       </w:pPr>
       <w:r>
@@ -2249,7 +2249,23 @@
           <w:color w:val="156082"/>
           <w:sz w:val="18"/>
         </w:rPr>
-        <w:t>OPENAI_BASE_URL=https://openai.vocareum.com/v1</w:t>
+        <w:t>OPENAI_BASE_URL=https://openai.vocareum.com/v1   # Vocareum users</w:t>
+      </w:r>
+    </w:p>
+    <w:p>
+      <w:pPr>
+        <w:spacing w:before="20" w:after="20"/>
+        <w:ind w:left="567"/>
+      </w:pPr>
+      <w:r>
+        <w:rPr>
+          <w:rFonts w:ascii="Courier New" w:hAnsi="Courier New"/>
+          <w:b w:val="0"/>
+          <w:i w:val="0"/>
+          <w:color w:val="156082"/>
+          <w:sz w:val="18"/>
+        </w:rPr>
+        <w:t>OPENAI_BASE_URL=                                  # Standard OpenAI (leave blank)</w:t>
       </w:r>
     </w:p>
     <w:p>
@@ -2264,7 +2280,7 @@
           <w:color w:val="000000"/>
           <w:sz w:val="20"/>
         </w:rPr>
-        <w:t>For standard OpenAI users, leave OPENAI_BASE_URL blank and use your sk-... key.</w:t>
+        <w:t>USE_MCP is true by default. The agent automatically detects whether the mcp package is installed and falls back to direct tool imports silently if not — no manual flag needed.</w:t>
       </w:r>
     </w:p>
     <w:p>
@@ -2274,7 +2290,7 @@
     </w:p>
     <w:p>
       <w:pPr>
-        <w:spacing w:before="80" w:after="40"/>
+        <w:spacing w:before="60" w:after="40"/>
         <w:ind w:left="283"/>
       </w:pPr>
       <w:r>
@@ -2295,12 +2311,12 @@
           <w:color w:val="000000"/>
           <w:sz w:val="20"/>
         </w:rPr>
-        <w:t>After ingest, start the Streamlit web UI:</w:t>
+        <w:t>After ingest, start the Streamlit UI:</w:t>
       </w:r>
     </w:p>
     <w:p>
       <w:pPr>
-        <w:spacing w:before="40" w:after="40"/>
+        <w:spacing w:before="20" w:after="20"/>
         <w:ind w:left="567"/>
       </w:pPr>
       <w:r>
@@ -2336,7 +2352,7 @@
     </w:p>
     <w:p>
       <w:pPr>
-        <w:spacing w:before="80" w:after="40"/>
+        <w:spacing w:before="60" w:after="40"/>
         <w:ind w:left="283"/>
       </w:pPr>
       <w:r>
@@ -2357,12 +2373,12 @@
           <w:color w:val="000000"/>
           <w:sz w:val="20"/>
         </w:rPr>
-        <w:t>All 424 tests (use USE_MCP=false to bypass the MCP package dependency):</w:t>
+        <w:t>424 tests across 16 files:</w:t>
       </w:r>
     </w:p>
     <w:p>
       <w:pPr>
-        <w:spacing w:before="40" w:after="40"/>
+        <w:spacing w:before="20" w:after="20"/>
         <w:ind w:left="567"/>
       </w:pPr>
       <w:r>
@@ -2373,13 +2389,13 @@
           <w:color w:val="156082"/>
           <w:sz w:val="18"/>
         </w:rPr>
-        <w:t>USE_MCP=false python -m pytest</w:t>
+        <w:t>python -m pytest</w:t>
       </w:r>
     </w:p>
     <w:sectPr>
       <w:footerReference w:type="default" r:id="rId9"/>
       <w:pgSz w:w="11906" w:h="16838"/>
-      <w:pgMar w:top="1440" w:right="1440" w:bottom="1440" w:left="1440" w:header="720" w:footer="720" w:gutter="0"/>
+      <w:pgMar w:top="1440" w:right="1083" w:bottom="1440" w:left="1083" w:header="720" w:footer="720" w:gutter="0"/>
       <w:cols w:space="720"/>
       <w:docGrid w:linePitch="360"/>
     </w:sectPr>

</xml_diff>